<commit_message>
Release course v1.0 with audited links, references, narration and exercise guides
</commit_message>
<xml_diff>
--- a/課題/A1_構造と成分から木材を説明する_学生用.docx
+++ b/課題/A1_構造と成分から木材を説明する_学生用.docx
@@ -704,7 +704,7 @@
           <w:b w:val="0"/>
           <w:sz w:val="17"/>
         </w:rPr>
-        <w:t>S4　主要構成成分と木質材料　USDA Forest Products Laboratory　Wood Handbook 2021 Chapter 11</w:t>
+        <w:t>S9　主要構成成分（木材化学）　USDA Forest Products Laboratory　Wood Handbook 2021 Chapter 3 Wood Chemistry（3–9頁）</w:t>
       </w:r>
     </w:p>
     <w:p>
@@ -713,7 +713,7 @@
           <w:b w:val="0"/>
           <w:sz w:val="16"/>
         </w:rPr>
-        <w:t>https://research.fs.usda.gov/treesearch/62258</w:t>
+        <w:t>https://research.fs.usda.gov/treesearch/62242</w:t>
       </w:r>
     </w:p>
     <w:p>

</xml_diff>